<commit_message>
Manual Version 1.2 addition
</commit_message>
<xml_diff>
--- a/Documentation/Falcon Programmer Manual.docx
+++ b/Documentation/Falcon Programmer Manual.docx
@@ -195,7 +195,7 @@
           <w:sz w:val="48"/>
           <w:szCs w:val="48"/>
         </w:rPr>
-        <w:t>1</w:t>
+        <w:t>2</w:t>
       </w:r>
       <w:r>
         <w:rPr>
@@ -203,14 +203,21 @@
           <w:szCs w:val="48"/>
           <w:vertAlign w:val="superscript"/>
         </w:rPr>
-        <w:t>st</w:t>
+        <w:t>nd</w:t>
       </w:r>
       <w:r>
         <w:rPr>
           <w:sz w:val="48"/>
           <w:szCs w:val="48"/>
         </w:rPr>
-        <w:t xml:space="preserve"> October</w:t>
+        <w:t xml:space="preserve"> </w:t>
+      </w:r>
+      <w:r>
+        <w:rPr>
+          <w:sz w:val="48"/>
+          <w:szCs w:val="48"/>
+        </w:rPr>
+        <w:t>October</w:t>
       </w:r>
       <w:r>
         <w:rPr>
@@ -333,7 +340,7 @@
             </w:rPr>
             <w:fldChar w:fldCharType="separate"/>
           </w:r>
-          <w:hyperlink w:anchor="_Toc241773858" w:history="1">
+          <w:hyperlink w:anchor="_Toc241832948" w:history="1">
             <w:r>
               <w:rPr>
                 <w:rStyle w:val="Hyperlink"/>
@@ -356,7 +363,7 @@
               <w:rPr>
                 <w:webHidden/>
               </w:rPr>
-              <w:instrText xml:space="preserve"> PAGEREF _Toc241773858 \h </w:instrText>
+              <w:instrText xml:space="preserve"> PAGEREF _Toc241832948 \h </w:instrText>
             </w:r>
             <w:r>
               <w:rPr>
@@ -391,7 +398,7 @@
               <w:lang w:eastAsia="en-NZ"/>
             </w:rPr>
           </w:pPr>
-          <w:hyperlink w:anchor="_Toc241773859" w:history="1">
+          <w:hyperlink w:anchor="_Toc241832949" w:history="1">
             <w:r>
               <w:rPr>
                 <w:rStyle w:val="Hyperlink"/>
@@ -414,7 +421,7 @@
               <w:rPr>
                 <w:webHidden/>
               </w:rPr>
-              <w:instrText xml:space="preserve"> PAGEREF _Toc241773859 \h </w:instrText>
+              <w:instrText xml:space="preserve"> PAGEREF _Toc241832949 \h </w:instrText>
             </w:r>
             <w:r>
               <w:rPr>
@@ -449,12 +456,12 @@
               <w:lang w:eastAsia="en-NZ"/>
             </w:rPr>
           </w:pPr>
-          <w:hyperlink w:anchor="_Toc241773860" w:history="1">
+          <w:hyperlink w:anchor="_Toc241832950" w:history="1">
             <w:r>
               <w:rPr>
                 <w:rStyle w:val="Hyperlink"/>
               </w:rPr>
-              <w:t>Getting started</w:t>
+              <w:t>macOS Installation Instructions</w:t>
             </w:r>
             <w:r>
               <w:rPr>
@@ -472,7 +479,7 @@
               <w:rPr>
                 <w:webHidden/>
               </w:rPr>
-              <w:instrText xml:space="preserve"> PAGEREF _Toc241773860 \h </w:instrText>
+              <w:instrText xml:space="preserve"> PAGEREF _Toc241832950 \h </w:instrText>
             </w:r>
             <w:r>
               <w:rPr>
@@ -507,12 +514,12 @@
               <w:lang w:eastAsia="en-NZ"/>
             </w:rPr>
           </w:pPr>
-          <w:hyperlink w:anchor="_Toc241773861" w:history="1">
+          <w:hyperlink w:anchor="_Toc241832951" w:history="1">
             <w:r>
               <w:rPr>
                 <w:rStyle w:val="Hyperlink"/>
               </w:rPr>
-              <w:t>More about running batch scripts</w:t>
+              <w:t>Getting started</w:t>
             </w:r>
             <w:r>
               <w:rPr>
@@ -530,7 +537,7 @@
               <w:rPr>
                 <w:webHidden/>
               </w:rPr>
-              <w:instrText xml:space="preserve"> PAGEREF _Toc241773861 \h </w:instrText>
+              <w:instrText xml:space="preserve"> PAGEREF _Toc241832951 \h </w:instrText>
             </w:r>
             <w:r>
               <w:rPr>
@@ -547,7 +554,7 @@
               <w:rPr>
                 <w:webHidden/>
               </w:rPr>
-              <w:t>9</w:t>
+              <w:t>5</w:t>
             </w:r>
             <w:r>
               <w:rPr>
@@ -565,11 +572,69 @@
               <w:lang w:eastAsia="en-NZ"/>
             </w:rPr>
           </w:pPr>
-          <w:hyperlink w:anchor="_Toc241773862" w:history="1">
+          <w:hyperlink w:anchor="_Toc241832952" w:history="1">
             <w:r>
               <w:rPr>
                 <w:rStyle w:val="Hyperlink"/>
               </w:rPr>
+              <w:t>More about running batch scripts</w:t>
+            </w:r>
+            <w:r>
+              <w:rPr>
+                <w:webHidden/>
+              </w:rPr>
+              <w:tab/>
+            </w:r>
+            <w:r>
+              <w:rPr>
+                <w:webHidden/>
+              </w:rPr>
+              <w:fldChar w:fldCharType="begin"/>
+            </w:r>
+            <w:r>
+              <w:rPr>
+                <w:webHidden/>
+              </w:rPr>
+              <w:instrText xml:space="preserve"> PAGEREF _Toc241832952 \h </w:instrText>
+            </w:r>
+            <w:r>
+              <w:rPr>
+                <w:webHidden/>
+              </w:rPr>
+            </w:r>
+            <w:r>
+              <w:rPr>
+                <w:webHidden/>
+              </w:rPr>
+              <w:fldChar w:fldCharType="separate"/>
+            </w:r>
+            <w:r>
+              <w:rPr>
+                <w:webHidden/>
+              </w:rPr>
+              <w:t>10</w:t>
+            </w:r>
+            <w:r>
+              <w:rPr>
+                <w:webHidden/>
+              </w:rPr>
+              <w:fldChar w:fldCharType="end"/>
+            </w:r>
+          </w:hyperlink>
+        </w:p>
+        <w:p>
+          <w:pPr>
+            <w:pStyle w:val="TOC1"/>
+            <w:rPr>
+              <w:rFonts w:asciiTheme="minorHAnsi" w:eastAsiaTheme="minorEastAsia" w:hAnsiTheme="minorHAnsi" w:cstheme="minorBidi"/>
+              <w:lang w:eastAsia="en-NZ"/>
+            </w:rPr>
+          </w:pPr>
+          <w:hyperlink w:anchor="_Toc241832953" w:history="1">
+            <w:r>
+              <w:rPr>
+                <w:rStyle w:val="Hyperlink"/>
+              </w:rPr>
               <w:t>Falcon Programmer is keyboard-friendly</w:t>
             </w:r>
             <w:r>
@@ -588,7 +653,7 @@
               <w:rPr>
                 <w:webHidden/>
               </w:rPr>
-              <w:instrText xml:space="preserve"> PAGEREF _Toc241773862 \h </w:instrText>
+              <w:instrText xml:space="preserve"> PAGEREF _Toc241832953 \h </w:instrText>
             </w:r>
             <w:r>
               <w:rPr>
@@ -605,7 +670,7 @@
               <w:rPr>
                 <w:webHidden/>
               </w:rPr>
-              <w:t>10</w:t>
+              <w:t>11</w:t>
             </w:r>
             <w:r>
               <w:rPr>
@@ -627,7 +692,7 @@
               <w:lang w:eastAsia="en-NZ"/>
             </w:rPr>
           </w:pPr>
-          <w:hyperlink w:anchor="_Toc241773863" w:history="1">
+          <w:hyperlink w:anchor="_Toc241832954" w:history="1">
             <w:r>
               <w:rPr>
                 <w:rStyle w:val="Hyperlink"/>
@@ -654,7 +719,7 @@
                 <w:noProof/>
                 <w:webHidden/>
               </w:rPr>
-              <w:instrText xml:space="preserve"> PAGEREF _Toc241773863 \h </w:instrText>
+              <w:instrText xml:space="preserve"> PAGEREF _Toc241832954 \h </w:instrText>
             </w:r>
             <w:r>
               <w:rPr>
@@ -674,7 +739,7 @@
                 <w:noProof/>
                 <w:webHidden/>
               </w:rPr>
-              <w:t>10</w:t>
+              <w:t>11</w:t>
             </w:r>
             <w:r>
               <w:rPr>
@@ -697,7 +762,7 @@
               <w:lang w:eastAsia="en-NZ"/>
             </w:rPr>
           </w:pPr>
-          <w:hyperlink w:anchor="_Toc241773864" w:history="1">
+          <w:hyperlink w:anchor="_Toc241832955" w:history="1">
             <w:r>
               <w:rPr>
                 <w:rStyle w:val="Hyperlink"/>
@@ -724,7 +789,7 @@
                 <w:noProof/>
                 <w:webHidden/>
               </w:rPr>
-              <w:instrText xml:space="preserve"> PAGEREF _Toc241773864 \h </w:instrText>
+              <w:instrText xml:space="preserve"> PAGEREF _Toc241832955 \h </w:instrText>
             </w:r>
             <w:r>
               <w:rPr>
@@ -744,7 +809,7 @@
                 <w:noProof/>
                 <w:webHidden/>
               </w:rPr>
-              <w:t>11</w:t>
+              <w:t>12</w:t>
             </w:r>
             <w:r>
               <w:rPr>
@@ -763,7 +828,7 @@
               <w:lang w:eastAsia="en-NZ"/>
             </w:rPr>
           </w:pPr>
-          <w:hyperlink w:anchor="_Toc241773865" w:history="1">
+          <w:hyperlink w:anchor="_Toc241832956" w:history="1">
             <w:r>
               <w:rPr>
                 <w:rStyle w:val="Hyperlink"/>
@@ -786,7 +851,7 @@
               <w:rPr>
                 <w:webHidden/>
               </w:rPr>
-              <w:instrText xml:space="preserve"> PAGEREF _Toc241773865 \h </w:instrText>
+              <w:instrText xml:space="preserve"> PAGEREF _Toc241832956 \h </w:instrText>
             </w:r>
             <w:r>
               <w:rPr>
@@ -803,7 +868,7 @@
               <w:rPr>
                 <w:webHidden/>
               </w:rPr>
-              <w:t>12</w:t>
+              <w:t>13</w:t>
             </w:r>
             <w:r>
               <w:rPr>
@@ -825,7 +890,7 @@
               <w:lang w:eastAsia="en-NZ"/>
             </w:rPr>
           </w:pPr>
-          <w:hyperlink w:anchor="_Toc241773866" w:history="1">
+          <w:hyperlink w:anchor="_Toc241832957" w:history="1">
             <w:r>
               <w:rPr>
                 <w:rStyle w:val="Hyperlink"/>
@@ -852,7 +917,7 @@
                 <w:noProof/>
                 <w:webHidden/>
               </w:rPr>
-              <w:instrText xml:space="preserve"> PAGEREF _Toc241773866 \h </w:instrText>
+              <w:instrText xml:space="preserve"> PAGEREF _Toc241832957 \h </w:instrText>
             </w:r>
             <w:r>
               <w:rPr>
@@ -872,7 +937,7 @@
                 <w:noProof/>
                 <w:webHidden/>
               </w:rPr>
-              <w:t>12</w:t>
+              <w:t>13</w:t>
             </w:r>
             <w:r>
               <w:rPr>
@@ -895,7 +960,7 @@
               <w:lang w:eastAsia="en-NZ"/>
             </w:rPr>
           </w:pPr>
-          <w:hyperlink w:anchor="_Toc241773867" w:history="1">
+          <w:hyperlink w:anchor="_Toc241832958" w:history="1">
             <w:r>
               <w:rPr>
                 <w:rStyle w:val="Hyperlink"/>
@@ -922,7 +987,7 @@
                 <w:noProof/>
                 <w:webHidden/>
               </w:rPr>
-              <w:instrText xml:space="preserve"> PAGEREF _Toc241773867 \h </w:instrText>
+              <w:instrText xml:space="preserve"> PAGEREF _Toc241832958 \h </w:instrText>
             </w:r>
             <w:r>
               <w:rPr>
@@ -942,7 +1007,7 @@
                 <w:noProof/>
                 <w:webHidden/>
               </w:rPr>
-              <w:t>15</w:t>
+              <w:t>16</w:t>
             </w:r>
             <w:r>
               <w:rPr>
@@ -965,7 +1030,7 @@
               <w:lang w:eastAsia="en-NZ"/>
             </w:rPr>
           </w:pPr>
-          <w:hyperlink w:anchor="_Toc241773868" w:history="1">
+          <w:hyperlink w:anchor="_Toc241832959" w:history="1">
             <w:r>
               <w:rPr>
                 <w:rStyle w:val="Hyperlink"/>
@@ -992,7 +1057,7 @@
                 <w:noProof/>
                 <w:webHidden/>
               </w:rPr>
-              <w:instrText xml:space="preserve"> PAGEREF _Toc241773868 \h </w:instrText>
+              <w:instrText xml:space="preserve"> PAGEREF _Toc241832959 \h </w:instrText>
             </w:r>
             <w:r>
               <w:rPr>
@@ -1012,7 +1077,7 @@
                 <w:noProof/>
                 <w:webHidden/>
               </w:rPr>
-              <w:t>15</w:t>
+              <w:t>16</w:t>
             </w:r>
             <w:r>
               <w:rPr>
@@ -1035,7 +1100,7 @@
               <w:lang w:eastAsia="en-NZ"/>
             </w:rPr>
           </w:pPr>
-          <w:hyperlink w:anchor="_Toc241773869" w:history="1">
+          <w:hyperlink w:anchor="_Toc241832960" w:history="1">
             <w:r>
               <w:rPr>
                 <w:rStyle w:val="Hyperlink"/>
@@ -1062,7 +1127,7 @@
                 <w:noProof/>
                 <w:webHidden/>
               </w:rPr>
-              <w:instrText xml:space="preserve"> PAGEREF _Toc241773869 \h </w:instrText>
+              <w:instrText xml:space="preserve"> PAGEREF _Toc241832960 \h </w:instrText>
             </w:r>
             <w:r>
               <w:rPr>
@@ -1082,7 +1147,7 @@
                 <w:noProof/>
                 <w:webHidden/>
               </w:rPr>
-              <w:t>16</w:t>
+              <w:t>17</w:t>
             </w:r>
             <w:r>
               <w:rPr>
@@ -1105,7 +1170,7 @@
               <w:lang w:eastAsia="en-NZ"/>
             </w:rPr>
           </w:pPr>
-          <w:hyperlink w:anchor="_Toc241773870" w:history="1">
+          <w:hyperlink w:anchor="_Toc241832961" w:history="1">
             <w:r>
               <w:rPr>
                 <w:rStyle w:val="Hyperlink"/>
@@ -1132,7 +1197,7 @@
                 <w:noProof/>
                 <w:webHidden/>
               </w:rPr>
-              <w:instrText xml:space="preserve"> PAGEREF _Toc241773870 \h </w:instrText>
+              <w:instrText xml:space="preserve"> PAGEREF _Toc241832961 \h </w:instrText>
             </w:r>
             <w:r>
               <w:rPr>
@@ -1152,7 +1217,7 @@
                 <w:noProof/>
                 <w:webHidden/>
               </w:rPr>
-              <w:t>16</w:t>
+              <w:t>17</w:t>
             </w:r>
             <w:r>
               <w:rPr>
@@ -1175,7 +1240,7 @@
               <w:lang w:eastAsia="en-NZ"/>
             </w:rPr>
           </w:pPr>
-          <w:hyperlink w:anchor="_Toc241773871" w:history="1">
+          <w:hyperlink w:anchor="_Toc241832962" w:history="1">
             <w:r>
               <w:rPr>
                 <w:rStyle w:val="Hyperlink"/>
@@ -1202,7 +1267,7 @@
                 <w:noProof/>
                 <w:webHidden/>
               </w:rPr>
-              <w:instrText xml:space="preserve"> PAGEREF _Toc241773871 \h </w:instrText>
+              <w:instrText xml:space="preserve"> PAGEREF _Toc241832962 \h </w:instrText>
             </w:r>
             <w:r>
               <w:rPr>
@@ -1222,7 +1287,7 @@
                 <w:noProof/>
                 <w:webHidden/>
               </w:rPr>
-              <w:t>17</w:t>
+              <w:t>18</w:t>
             </w:r>
             <w:r>
               <w:rPr>
@@ -1241,7 +1306,7 @@
               <w:lang w:eastAsia="en-NZ"/>
             </w:rPr>
           </w:pPr>
-          <w:hyperlink w:anchor="_Toc241773872" w:history="1">
+          <w:hyperlink w:anchor="_Toc241832963" w:history="1">
             <w:r>
               <w:rPr>
                 <w:rStyle w:val="Hyperlink"/>
@@ -1264,7 +1329,7 @@
               <w:rPr>
                 <w:webHidden/>
               </w:rPr>
-              <w:instrText xml:space="preserve"> PAGEREF _Toc241773872 \h </w:instrText>
+              <w:instrText xml:space="preserve"> PAGEREF _Toc241832963 \h </w:instrText>
             </w:r>
             <w:r>
               <w:rPr>
@@ -1281,7 +1346,7 @@
               <w:rPr>
                 <w:webHidden/>
               </w:rPr>
-              <w:t>19</w:t>
+              <w:t>20</w:t>
             </w:r>
             <w:r>
               <w:rPr>
@@ -1303,7 +1368,7 @@
               <w:lang w:eastAsia="en-NZ"/>
             </w:rPr>
           </w:pPr>
-          <w:hyperlink w:anchor="_Toc241773873" w:history="1">
+          <w:hyperlink w:anchor="_Toc241832964" w:history="1">
             <w:r>
               <w:rPr>
                 <w:rStyle w:val="Hyperlink"/>
@@ -1330,7 +1395,7 @@
                 <w:noProof/>
                 <w:webHidden/>
               </w:rPr>
-              <w:instrText xml:space="preserve"> PAGEREF _Toc241773873 \h </w:instrText>
+              <w:instrText xml:space="preserve"> PAGEREF _Toc241832964 \h </w:instrText>
             </w:r>
             <w:r>
               <w:rPr>
@@ -1350,7 +1415,7 @@
                 <w:noProof/>
                 <w:webHidden/>
               </w:rPr>
-              <w:t>19</w:t>
+              <w:t>20</w:t>
             </w:r>
             <w:r>
               <w:rPr>
@@ -1373,7 +1438,7 @@
               <w:lang w:eastAsia="en-NZ"/>
             </w:rPr>
           </w:pPr>
-          <w:hyperlink w:anchor="_Toc241773874" w:history="1">
+          <w:hyperlink w:anchor="_Toc241832965" w:history="1">
             <w:r>
               <w:rPr>
                 <w:rStyle w:val="Hyperlink"/>
@@ -1400,7 +1465,7 @@
                 <w:noProof/>
                 <w:webHidden/>
               </w:rPr>
-              <w:instrText xml:space="preserve"> PAGEREF _Toc241773874 \h </w:instrText>
+              <w:instrText xml:space="preserve"> PAGEREF _Toc241832965 \h </w:instrText>
             </w:r>
             <w:r>
               <w:rPr>
@@ -1420,7 +1485,7 @@
                 <w:noProof/>
                 <w:webHidden/>
               </w:rPr>
-              <w:t>20</w:t>
+              <w:t>21</w:t>
             </w:r>
             <w:r>
               <w:rPr>
@@ -1443,7 +1508,7 @@
               <w:lang w:eastAsia="en-NZ"/>
             </w:rPr>
           </w:pPr>
-          <w:hyperlink w:anchor="_Toc241773875" w:history="1">
+          <w:hyperlink w:anchor="_Toc241832966" w:history="1">
             <w:r>
               <w:rPr>
                 <w:rStyle w:val="Hyperlink"/>
@@ -1470,7 +1535,7 @@
                 <w:noProof/>
                 <w:webHidden/>
               </w:rPr>
-              <w:instrText xml:space="preserve"> PAGEREF _Toc241773875 \h </w:instrText>
+              <w:instrText xml:space="preserve"> PAGEREF _Toc241832966 \h </w:instrText>
             </w:r>
             <w:r>
               <w:rPr>
@@ -1490,7 +1555,7 @@
                 <w:noProof/>
                 <w:webHidden/>
               </w:rPr>
-              <w:t>21</w:t>
+              <w:t>22</w:t>
             </w:r>
             <w:r>
               <w:rPr>
@@ -1513,7 +1578,7 @@
               <w:lang w:eastAsia="en-NZ"/>
             </w:rPr>
           </w:pPr>
-          <w:hyperlink w:anchor="_Toc241773876" w:history="1">
+          <w:hyperlink w:anchor="_Toc241832967" w:history="1">
             <w:r>
               <w:rPr>
                 <w:rStyle w:val="Hyperlink"/>
@@ -1540,7 +1605,7 @@
                 <w:noProof/>
                 <w:webHidden/>
               </w:rPr>
-              <w:instrText xml:space="preserve"> PAGEREF _Toc241773876 \h </w:instrText>
+              <w:instrText xml:space="preserve"> PAGEREF _Toc241832967 \h </w:instrText>
             </w:r>
             <w:r>
               <w:rPr>
@@ -1560,7 +1625,7 @@
                 <w:noProof/>
                 <w:webHidden/>
               </w:rPr>
-              <w:t>22</w:t>
+              <w:t>23</w:t>
             </w:r>
             <w:r>
               <w:rPr>
@@ -1583,7 +1648,7 @@
               <w:lang w:eastAsia="en-NZ"/>
             </w:rPr>
           </w:pPr>
-          <w:hyperlink w:anchor="_Toc241773877" w:history="1">
+          <w:hyperlink w:anchor="_Toc241832968" w:history="1">
             <w:r>
               <w:rPr>
                 <w:rStyle w:val="Hyperlink"/>
@@ -1610,7 +1675,7 @@
                 <w:noProof/>
                 <w:webHidden/>
               </w:rPr>
-              <w:instrText xml:space="preserve"> PAGEREF _Toc241773877 \h </w:instrText>
+              <w:instrText xml:space="preserve"> PAGEREF _Toc241832968 \h </w:instrText>
             </w:r>
             <w:r>
               <w:rPr>
@@ -1630,7 +1695,7 @@
                 <w:noProof/>
                 <w:webHidden/>
               </w:rPr>
-              <w:t>22</w:t>
+              <w:t>23</w:t>
             </w:r>
             <w:r>
               <w:rPr>
@@ -1653,7 +1718,7 @@
               <w:lang w:eastAsia="en-NZ"/>
             </w:rPr>
           </w:pPr>
-          <w:hyperlink w:anchor="_Toc241773878" w:history="1">
+          <w:hyperlink w:anchor="_Toc241832969" w:history="1">
             <w:r>
               <w:rPr>
                 <w:rStyle w:val="Hyperlink"/>
@@ -1680,7 +1745,7 @@
                 <w:noProof/>
                 <w:webHidden/>
               </w:rPr>
-              <w:instrText xml:space="preserve"> PAGEREF _Toc241773878 \h </w:instrText>
+              <w:instrText xml:space="preserve"> PAGEREF _Toc241832969 \h </w:instrText>
             </w:r>
             <w:r>
               <w:rPr>
@@ -1700,7 +1765,7 @@
                 <w:noProof/>
                 <w:webHidden/>
               </w:rPr>
-              <w:t>23</w:t>
+              <w:t>24</w:t>
             </w:r>
             <w:r>
               <w:rPr>
@@ -1723,7 +1788,7 @@
               <w:lang w:eastAsia="en-NZ"/>
             </w:rPr>
           </w:pPr>
-          <w:hyperlink w:anchor="_Toc241773879" w:history="1">
+          <w:hyperlink w:anchor="_Toc241832970" w:history="1">
             <w:r>
               <w:rPr>
                 <w:rStyle w:val="Hyperlink"/>
@@ -1750,7 +1815,7 @@
                 <w:noProof/>
                 <w:webHidden/>
               </w:rPr>
-              <w:instrText xml:space="preserve"> PAGEREF _Toc241773879 \h </w:instrText>
+              <w:instrText xml:space="preserve"> PAGEREF _Toc241832970 \h </w:instrText>
             </w:r>
             <w:r>
               <w:rPr>
@@ -1770,7 +1835,7 @@
                 <w:noProof/>
                 <w:webHidden/>
               </w:rPr>
-              <w:t>23</w:t>
+              <w:t>24</w:t>
             </w:r>
             <w:r>
               <w:rPr>
@@ -1793,7 +1858,7 @@
               <w:lang w:eastAsia="en-NZ"/>
             </w:rPr>
           </w:pPr>
-          <w:hyperlink w:anchor="_Toc241773880" w:history="1">
+          <w:hyperlink w:anchor="_Toc241832971" w:history="1">
             <w:r>
               <w:rPr>
                 <w:rStyle w:val="Hyperlink"/>
@@ -1820,7 +1885,7 @@
                 <w:noProof/>
                 <w:webHidden/>
               </w:rPr>
-              <w:instrText xml:space="preserve"> PAGEREF _Toc241773880 \h </w:instrText>
+              <w:instrText xml:space="preserve"> PAGEREF _Toc241832971 \h </w:instrText>
             </w:r>
             <w:r>
               <w:rPr>
@@ -1840,7 +1905,7 @@
                 <w:noProof/>
                 <w:webHidden/>
               </w:rPr>
-              <w:t>24</w:t>
+              <w:t>25</w:t>
             </w:r>
             <w:r>
               <w:rPr>
@@ -1863,7 +1928,7 @@
               <w:lang w:eastAsia="en-NZ"/>
             </w:rPr>
           </w:pPr>
-          <w:hyperlink w:anchor="_Toc241773881" w:history="1">
+          <w:hyperlink w:anchor="_Toc241832972" w:history="1">
             <w:r>
               <w:rPr>
                 <w:rStyle w:val="Hyperlink"/>
@@ -1890,7 +1955,7 @@
                 <w:noProof/>
                 <w:webHidden/>
               </w:rPr>
-              <w:instrText xml:space="preserve"> PAGEREF _Toc241773881 \h </w:instrText>
+              <w:instrText xml:space="preserve"> PAGEREF _Toc241832972 \h </w:instrText>
             </w:r>
             <w:r>
               <w:rPr>
@@ -1910,7 +1975,7 @@
                 <w:noProof/>
                 <w:webHidden/>
               </w:rPr>
-              <w:t>24</w:t>
+              <w:t>25</w:t>
             </w:r>
             <w:r>
               <w:rPr>
@@ -1933,7 +1998,7 @@
               <w:lang w:eastAsia="en-NZ"/>
             </w:rPr>
           </w:pPr>
-          <w:hyperlink w:anchor="_Toc241773882" w:history="1">
+          <w:hyperlink w:anchor="_Toc241832973" w:history="1">
             <w:r>
               <w:rPr>
                 <w:rStyle w:val="Hyperlink"/>
@@ -1960,7 +2025,7 @@
                 <w:noProof/>
                 <w:webHidden/>
               </w:rPr>
-              <w:instrText xml:space="preserve"> PAGEREF _Toc241773882 \h </w:instrText>
+              <w:instrText xml:space="preserve"> PAGEREF _Toc241832973 \h </w:instrText>
             </w:r>
             <w:r>
               <w:rPr>
@@ -1980,7 +2045,7 @@
                 <w:noProof/>
                 <w:webHidden/>
               </w:rPr>
-              <w:t>25</w:t>
+              <w:t>26</w:t>
             </w:r>
             <w:r>
               <w:rPr>
@@ -2003,7 +2068,7 @@
               <w:lang w:eastAsia="en-NZ"/>
             </w:rPr>
           </w:pPr>
-          <w:hyperlink w:anchor="_Toc241773883" w:history="1">
+          <w:hyperlink w:anchor="_Toc241832974" w:history="1">
             <w:r>
               <w:rPr>
                 <w:rStyle w:val="Hyperlink"/>
@@ -2030,7 +2095,7 @@
                 <w:noProof/>
                 <w:webHidden/>
               </w:rPr>
-              <w:instrText xml:space="preserve"> PAGEREF _Toc241773883 \h </w:instrText>
+              <w:instrText xml:space="preserve"> PAGEREF _Toc241832974 \h </w:instrText>
             </w:r>
             <w:r>
               <w:rPr>
@@ -2050,7 +2115,7 @@
                 <w:noProof/>
                 <w:webHidden/>
               </w:rPr>
-              <w:t>25</w:t>
+              <w:t>26</w:t>
             </w:r>
             <w:r>
               <w:rPr>
@@ -2073,7 +2138,7 @@
               <w:lang w:eastAsia="en-NZ"/>
             </w:rPr>
           </w:pPr>
-          <w:hyperlink w:anchor="_Toc241773884" w:history="1">
+          <w:hyperlink w:anchor="_Toc241832975" w:history="1">
             <w:r>
               <w:rPr>
                 <w:rStyle w:val="Hyperlink"/>
@@ -2100,7 +2165,7 @@
                 <w:noProof/>
                 <w:webHidden/>
               </w:rPr>
-              <w:instrText xml:space="preserve"> PAGEREF _Toc241773884 \h </w:instrText>
+              <w:instrText xml:space="preserve"> PAGEREF _Toc241832975 \h </w:instrText>
             </w:r>
             <w:r>
               <w:rPr>
@@ -2120,7 +2185,7 @@
                 <w:noProof/>
                 <w:webHidden/>
               </w:rPr>
-              <w:t>26</w:t>
+              <w:t>27</w:t>
             </w:r>
             <w:r>
               <w:rPr>
@@ -2143,7 +2208,7 @@
               <w:lang w:eastAsia="en-NZ"/>
             </w:rPr>
           </w:pPr>
-          <w:hyperlink w:anchor="_Toc241773885" w:history="1">
+          <w:hyperlink w:anchor="_Toc241832976" w:history="1">
             <w:r>
               <w:rPr>
                 <w:rStyle w:val="Hyperlink"/>
@@ -2170,7 +2235,7 @@
                 <w:noProof/>
                 <w:webHidden/>
               </w:rPr>
-              <w:instrText xml:space="preserve"> PAGEREF _Toc241773885 \h </w:instrText>
+              <w:instrText xml:space="preserve"> PAGEREF _Toc241832976 \h </w:instrText>
             </w:r>
             <w:r>
               <w:rPr>
@@ -2190,7 +2255,7 @@
                 <w:noProof/>
                 <w:webHidden/>
               </w:rPr>
-              <w:t>27</w:t>
+              <w:t>28</w:t>
             </w:r>
             <w:r>
               <w:rPr>
@@ -2213,7 +2278,7 @@
               <w:lang w:eastAsia="en-NZ"/>
             </w:rPr>
           </w:pPr>
-          <w:hyperlink w:anchor="_Toc241773886" w:history="1">
+          <w:hyperlink w:anchor="_Toc241832977" w:history="1">
             <w:r>
               <w:rPr>
                 <w:rStyle w:val="Hyperlink"/>
@@ -2240,7 +2305,7 @@
                 <w:noProof/>
                 <w:webHidden/>
               </w:rPr>
-              <w:instrText xml:space="preserve"> PAGEREF _Toc241773886 \h </w:instrText>
+              <w:instrText xml:space="preserve"> PAGEREF _Toc241832977 \h </w:instrText>
             </w:r>
             <w:r>
               <w:rPr>
@@ -2260,7 +2325,7 @@
                 <w:noProof/>
                 <w:webHidden/>
               </w:rPr>
-              <w:t>27</w:t>
+              <w:t>28</w:t>
             </w:r>
             <w:r>
               <w:rPr>
@@ -2299,7 +2364,7 @@
         </w:rPr>
         <w:br w:type="page"/>
       </w:r>
-      <w:bookmarkStart w:id="0" w:name="_Toc241773858"/>
+      <w:bookmarkStart w:id="0" w:name="_Toc241832948"/>
       <w:r>
         <w:lastRenderedPageBreak/>
         <w:t>What's New in Version 1.2</w:t>
@@ -2345,7 +2410,7 @@
           <w:szCs w:val="48"/>
         </w:rPr>
       </w:pPr>
-      <w:bookmarkStart w:id="1" w:name="_Toc241773859"/>
+      <w:bookmarkStart w:id="1" w:name="_Toc241832949"/>
       <w:r>
         <w:t>Introduction</w:t>
       </w:r>
@@ -2737,6 +2802,31 @@
       </w:r>
     </w:p>
     <w:p>
+      <w:r>
+        <w:br w:type="page"/>
+      </w:r>
+    </w:p>
+    <w:p>
+      <w:pPr>
+        <w:pStyle w:val="Heading1"/>
+      </w:pPr>
+      <w:bookmarkStart w:id="2" w:name="_Toc241826213"/>
+      <w:bookmarkStart w:id="3" w:name="_Toc241832950"/>
+      <w:r>
+        <w:lastRenderedPageBreak/>
+        <w:t xml:space="preserve">macOS </w:t>
+      </w:r>
+      <w:r>
+        <w:t>Installation</w:t>
+      </w:r>
+      <w:r>
+        <w:t xml:space="preserve"> Instructions</w:t>
+      </w:r>
+      <w:bookmarkEnd w:id="2"/>
+      <w:bookmarkEnd w:id="3"/>
+    </w:p>
+    <w:p/>
+    <w:p>
       <w:pPr>
         <w:pStyle w:val="ListBullet"/>
         <w:numPr>
@@ -2744,17 +2834,212 @@
           <w:numId w:val="0"/>
         </w:numPr>
       </w:pPr>
-    </w:p>
-    <w:p>
-      <w:pPr>
-        <w:rPr>
-          <w:rFonts w:cs="Arial"/>
+      <w:r>
+        <w:t>Open the installer DMG and drag Falcon Programmer into Applications. Then take one of the following approaches.</w:t>
+      </w:r>
+    </w:p>
+    <w:p/>
+    <w:p>
+      <w:pPr>
+        <w:rPr>
           <w:b/>
+          <w:bCs/>
+        </w:rPr>
+      </w:pPr>
+      <w:r>
+        <w:rPr>
+          <w:b/>
+          <w:bCs/>
+        </w:rPr>
+        <w:t>Approach A</w:t>
+      </w:r>
+    </w:p>
+    <w:p/>
+    <w:p>
+      <w:pPr>
+        <w:pStyle w:val="ListParagraph"/>
+        <w:numPr>
+          <w:ilvl w:val="0"/>
+          <w:numId w:val="18"/>
+        </w:numPr>
+        <w:ind w:left="360"/>
+      </w:pPr>
+      <w:r>
+        <w:t xml:space="preserve">Open the app. When a security prompt headed '"Falcon Programmer" not Opened' appears, click </w:t>
+      </w:r>
+      <w:r>
+        <w:rPr>
+          <w:b/>
+          <w:bCs/>
+        </w:rPr>
+        <w:t>Done</w:t>
+      </w:r>
+      <w:r>
+        <w:t xml:space="preserve">. </w:t>
+      </w:r>
+      <w:r>
+        <w:rPr>
+          <w:i/>
           <w:iCs/>
-          <w:sz w:val="32"/>
+        </w:rPr>
+        <w:t>Do not click Move to Bin.</w:t>
+      </w:r>
+    </w:p>
+    <w:p>
+      <w:pPr>
+        <w:pStyle w:val="ListParagraph"/>
+        <w:numPr>
+          <w:ilvl w:val="0"/>
+          <w:numId w:val="18"/>
+        </w:numPr>
+        <w:ind w:left="360"/>
+      </w:pPr>
+      <w:r>
+        <w:t xml:space="preserve">Go to </w:t>
+      </w:r>
+      <w:r>
+        <w:rPr>
+          <w:b/>
+          <w:bCs/>
+        </w:rPr>
+        <w:t>System Settings</w:t>
+      </w:r>
+      <w:r>
+        <w:t xml:space="preserve"> </w:t>
+      </w:r>
+      <w:r>
+        <w:rPr>
+          <w:rFonts w:ascii="Arial" w:hAnsi="Arial" w:cs="Arial"/>
+        </w:rPr>
+        <w:t>→</w:t>
+      </w:r>
+      <w:r>
+        <w:t xml:space="preserve"> </w:t>
+      </w:r>
+      <w:r>
+        <w:rPr>
+          <w:b/>
+          <w:bCs/>
+        </w:rPr>
+        <w:t>Privacy &amp; Security</w:t>
+      </w:r>
+      <w:r>
+        <w:t xml:space="preserve">. Scroll down to </w:t>
+      </w:r>
+      <w:r>
+        <w:rPr>
+          <w:b/>
+          <w:bCs/>
+        </w:rPr>
+        <w:t>Security</w:t>
+      </w:r>
+      <w:r>
+        <w:t xml:space="preserve">, and click </w:t>
+      </w:r>
+      <w:r>
+        <w:rPr>
+          <w:b/>
+          <w:bCs/>
+        </w:rPr>
+        <w:t>Open Anyway</w:t>
+      </w:r>
+      <w:r>
+        <w:t>.</w:t>
+      </w:r>
+    </w:p>
+    <w:p>
+      <w:pPr>
+        <w:pStyle w:val="ListParagraph"/>
+        <w:numPr>
+          <w:ilvl w:val="0"/>
+          <w:numId w:val="18"/>
+        </w:numPr>
+        <w:ind w:left="360"/>
+      </w:pPr>
+      <w:r>
+        <w:t xml:space="preserve">On the confirmation prompt, click </w:t>
+      </w:r>
+      <w:r>
+        <w:rPr>
+          <w:b/>
+          <w:bCs/>
+        </w:rPr>
+        <w:t>Open Anyway</w:t>
+      </w:r>
+      <w:r>
+        <w:t>. (This is only required on the very first launch).</w:t>
+      </w:r>
+    </w:p>
+    <w:p/>
+    <w:p>
+      <w:pPr>
+        <w:rPr>
+          <w:b/>
+          <w:bCs/>
+        </w:rPr>
+      </w:pPr>
+      <w:r>
+        <w:rPr>
+          <w:b/>
+          <w:bCs/>
+        </w:rPr>
+        <w:t>Approach B</w:t>
+      </w:r>
+    </w:p>
+    <w:p/>
+    <w:p>
+      <w:r>
+        <w:t>Run this in Terminal:</w:t>
+      </w:r>
+    </w:p>
+    <w:p/>
+    <w:p>
+      <w:pPr>
+        <w:ind w:left="720"/>
+        <w:rPr>
+          <w:rFonts w:ascii="Georgia" w:hAnsi="Georgia"/>
+          <w:lang w:val="fr-FR"/>
+        </w:rPr>
+      </w:pPr>
+      <w:r>
+        <w:rPr>
+          <w:rFonts w:ascii="Georgia" w:hAnsi="Georgia"/>
+          <w:lang w:val="fr-FR"/>
+        </w:rPr>
+        <w:t>xattr -cr "/Applications/Falcon Programmer.app"</w:t>
+      </w:r>
+    </w:p>
+    <w:p>
+      <w:pPr>
+        <w:rPr>
+          <w:lang w:val="fr-FR"/>
+        </w:rPr>
+      </w:pPr>
+    </w:p>
+    <w:p>
+      <w:pPr>
+        <w:pStyle w:val="ListBullet"/>
+        <w:numPr>
+          <w:ilvl w:val="0"/>
+          <w:numId w:val="0"/>
+        </w:numPr>
+      </w:pPr>
+      <w:r>
+        <w:t>Once executed, the application will open directly upon double-clicking.</w:t>
+      </w:r>
+    </w:p>
+    <w:p/>
+    <w:p/>
+    <w:p>
+      <w:pPr>
+        <w:rPr>
+          <w:b/>
+          <w:sz w:val="36"/>
           <w:szCs w:val="28"/>
         </w:rPr>
       </w:pPr>
+      <w:bookmarkStart w:id="4" w:name="_Getting_started"/>
+      <w:bookmarkEnd w:id="4"/>
       <w:r>
         <w:br w:type="page"/>
       </w:r>
@@ -2763,9 +3048,7 @@
       <w:pPr>
         <w:pStyle w:val="Heading1"/>
       </w:pPr>
-      <w:bookmarkStart w:id="2" w:name="_Getting_started"/>
-      <w:bookmarkStart w:id="3" w:name="_Toc241773860"/>
-      <w:bookmarkEnd w:id="2"/>
+      <w:bookmarkStart w:id="5" w:name="_Toc241832951"/>
       <w:r>
         <w:lastRenderedPageBreak/>
         <w:t xml:space="preserve">Getting </w:t>
@@ -2776,7 +3059,7 @@
       <w:r>
         <w:t>tarted</w:t>
       </w:r>
-      <w:bookmarkEnd w:id="3"/>
+      <w:bookmarkEnd w:id="5"/>
     </w:p>
     <w:p/>
     <w:p>
@@ -4239,7 +4522,7 @@
       <w:pPr>
         <w:pStyle w:val="Heading1"/>
       </w:pPr>
-      <w:bookmarkStart w:id="4" w:name="_Toc241773861"/>
+      <w:bookmarkStart w:id="6" w:name="_Toc241832952"/>
       <w:r>
         <w:lastRenderedPageBreak/>
         <w:t xml:space="preserve">More </w:t>
@@ -4253,7 +4536,7 @@
       <w:r>
         <w:t xml:space="preserve"> running batch scripts</w:t>
       </w:r>
-      <w:bookmarkEnd w:id="4"/>
+      <w:bookmarkEnd w:id="6"/>
     </w:p>
     <w:p/>
     <w:p>
@@ -4610,7 +4893,7 @@
       <w:pPr>
         <w:pStyle w:val="Heading1"/>
       </w:pPr>
-      <w:bookmarkStart w:id="5" w:name="_Toc241773862"/>
+      <w:bookmarkStart w:id="7" w:name="_Toc241832953"/>
       <w:r>
         <w:lastRenderedPageBreak/>
         <w:t xml:space="preserve">Falcon Programmer is </w:t>
@@ -4627,7 +4910,7 @@
       <w:r>
         <w:t>riendly</w:t>
       </w:r>
-      <w:bookmarkEnd w:id="5"/>
+      <w:bookmarkEnd w:id="7"/>
     </w:p>
     <w:p/>
     <w:p>
@@ -4700,11 +4983,11 @@
       <w:pPr>
         <w:pStyle w:val="Heading3"/>
       </w:pPr>
-      <w:bookmarkStart w:id="6" w:name="_Toc241773863"/>
+      <w:bookmarkStart w:id="8" w:name="_Toc241832954"/>
       <w:r>
         <w:t>Hotkeys</w:t>
       </w:r>
-      <w:bookmarkEnd w:id="6"/>
+      <w:bookmarkEnd w:id="8"/>
     </w:p>
     <w:p/>
     <w:p>
@@ -4964,12 +5247,12 @@
       <w:pPr>
         <w:pStyle w:val="Heading3"/>
       </w:pPr>
-      <w:bookmarkStart w:id="7" w:name="_Toc241773864"/>
+      <w:bookmarkStart w:id="9" w:name="_Toc241832955"/>
       <w:r>
         <w:lastRenderedPageBreak/>
         <w:t>Grid keyboard shortcuts</w:t>
       </w:r>
-      <w:bookmarkEnd w:id="7"/>
+      <w:bookmarkEnd w:id="9"/>
     </w:p>
     <w:p/>
     <w:p>
@@ -5148,14 +5431,14 @@
       <w:pPr>
         <w:pStyle w:val="Heading1"/>
       </w:pPr>
-      <w:bookmarkStart w:id="8" w:name="_Script-based_vs_standard"/>
-      <w:bookmarkStart w:id="9" w:name="_Toc241773865"/>
-      <w:bookmarkEnd w:id="8"/>
+      <w:bookmarkStart w:id="10" w:name="_Script-based_vs_standard"/>
+      <w:bookmarkStart w:id="11" w:name="_Toc241832956"/>
+      <w:bookmarkEnd w:id="10"/>
       <w:r>
         <w:lastRenderedPageBreak/>
         <w:t>Script-based vs standard Info pages</w:t>
       </w:r>
-      <w:bookmarkEnd w:id="9"/>
+      <w:bookmarkEnd w:id="11"/>
     </w:p>
     <w:p/>
     <w:p>
@@ -5346,7 +5629,7 @@
       <w:pPr>
         <w:pStyle w:val="Heading2"/>
       </w:pPr>
-      <w:bookmarkStart w:id="10" w:name="_Toc241773866"/>
+      <w:bookmarkStart w:id="12" w:name="_Toc241832957"/>
       <w:r>
         <w:t>W</w:t>
       </w:r>
@@ -5359,7 +5642,7 @@
       <w:r>
         <w:t xml:space="preserve"> you want to replace a script-based Info page with a standard Info page?</w:t>
       </w:r>
-      <w:bookmarkEnd w:id="10"/>
+      <w:bookmarkEnd w:id="12"/>
     </w:p>
     <w:p/>
     <w:p>
@@ -6385,9 +6668,9 @@
       <w:pPr>
         <w:pStyle w:val="Heading2"/>
       </w:pPr>
-      <w:bookmarkStart w:id="11" w:name="_Mandatory_script-based_Info"/>
-      <w:bookmarkStart w:id="12" w:name="_Toc241773867"/>
-      <w:bookmarkEnd w:id="11"/>
+      <w:bookmarkStart w:id="13" w:name="_Mandatory_script-based_Info"/>
+      <w:bookmarkStart w:id="14" w:name="_Toc241832958"/>
+      <w:bookmarkEnd w:id="13"/>
       <w:r>
         <w:t xml:space="preserve">Mandatory </w:t>
       </w:r>
@@ -6403,7 +6686,7 @@
       <w:r>
         <w:t>Info pages</w:t>
       </w:r>
-      <w:bookmarkEnd w:id="12"/>
+      <w:bookmarkEnd w:id="14"/>
       <w:r>
         <w:t xml:space="preserve"> </w:t>
       </w:r>
@@ -6650,7 +6933,7 @@
       <w:pPr>
         <w:pStyle w:val="Heading2"/>
       </w:pPr>
-      <w:bookmarkStart w:id="13" w:name="_Toc241773868"/>
+      <w:bookmarkStart w:id="15" w:name="_Toc241832959"/>
       <w:r>
         <w:t xml:space="preserve">GUI </w:t>
       </w:r>
@@ -6666,7 +6949,7 @@
       <w:r>
         <w:t>rocessor page defaults</w:t>
       </w:r>
-      <w:bookmarkEnd w:id="13"/>
+      <w:bookmarkEnd w:id="15"/>
     </w:p>
     <w:p>
       <w:pPr>
@@ -6795,9 +7078,9 @@
           <w:sz w:val="28"/>
         </w:rPr>
       </w:pPr>
-      <w:bookmarkStart w:id="14" w:name="_GUI_script_processor"/>
-      <w:bookmarkStart w:id="15" w:name="_Toc241773869"/>
-      <w:bookmarkEnd w:id="14"/>
+      <w:bookmarkStart w:id="16" w:name="_GUI_script_processor"/>
+      <w:bookmarkStart w:id="17" w:name="_Toc241832960"/>
+      <w:bookmarkEnd w:id="16"/>
       <w:r>
         <w:t xml:space="preserve">GUI </w:t>
       </w:r>
@@ -6819,7 +7102,7 @@
       <w:r>
         <w:t>emplates</w:t>
       </w:r>
-      <w:bookmarkEnd w:id="15"/>
+      <w:bookmarkEnd w:id="17"/>
     </w:p>
     <w:p/>
     <w:p>
@@ -7155,11 +7438,11 @@
       <w:pPr>
         <w:pStyle w:val="Heading3"/>
       </w:pPr>
-      <w:bookmarkStart w:id="16" w:name="_Toc241773870"/>
+      <w:bookmarkStart w:id="18" w:name="_Toc241832961"/>
       <w:r>
         <w:t>User-defined templates</w:t>
       </w:r>
-      <w:bookmarkEnd w:id="16"/>
+      <w:bookmarkEnd w:id="18"/>
     </w:p>
     <w:p/>
     <w:p>
@@ -7431,11 +7714,11 @@
       <w:pPr>
         <w:pStyle w:val="Heading3"/>
       </w:pPr>
-      <w:bookmarkStart w:id="17" w:name="_Toc241773871"/>
+      <w:bookmarkStart w:id="19" w:name="_Toc241832962"/>
       <w:r>
         <w:t>User-defined template creation: optional additional step</w:t>
       </w:r>
-      <w:bookmarkEnd w:id="17"/>
+      <w:bookmarkEnd w:id="19"/>
     </w:p>
     <w:p/>
     <w:p>
@@ -8984,7 +9267,7 @@
       <w:pPr>
         <w:pStyle w:val="Heading1"/>
       </w:pPr>
-      <w:bookmarkStart w:id="18" w:name="_Toc241773872"/>
+      <w:bookmarkStart w:id="20" w:name="_Toc241832963"/>
       <w:r>
         <w:lastRenderedPageBreak/>
         <w:t>Configuration Tasks</w:t>
@@ -8992,7 +9275,7 @@
       <w:r>
         <w:t xml:space="preserve"> Reference</w:t>
       </w:r>
-      <w:bookmarkEnd w:id="18"/>
+      <w:bookmarkEnd w:id="20"/>
     </w:p>
     <w:p/>
     <w:p>
@@ -9003,16 +9286,16 @@
           <w:noProof/>
         </w:rPr>
       </w:pPr>
-      <w:bookmarkStart w:id="19" w:name="_AssignMacroCcs"/>
-      <w:bookmarkStart w:id="20" w:name="_Toc241773873"/>
-      <w:bookmarkEnd w:id="19"/>
+      <w:bookmarkStart w:id="21" w:name="_AssignMacroCcs"/>
+      <w:bookmarkStart w:id="22" w:name="_Toc241832964"/>
+      <w:bookmarkEnd w:id="21"/>
       <w:r>
         <w:rPr>
           <w:noProof/>
         </w:rPr>
         <w:t>AssignMacroCcs</w:t>
       </w:r>
-      <w:bookmarkEnd w:id="20"/>
+      <w:bookmarkEnd w:id="22"/>
     </w:p>
     <w:p/>
     <w:p>
@@ -10077,8 +10360,8 @@
           <w:szCs w:val="28"/>
         </w:rPr>
       </w:pPr>
-      <w:bookmarkStart w:id="21" w:name="_InitialiseLayout"/>
-      <w:bookmarkEnd w:id="21"/>
+      <w:bookmarkStart w:id="23" w:name="_InitialiseLayout"/>
+      <w:bookmarkEnd w:id="23"/>
     </w:p>
     <w:p>
       <w:pPr>
@@ -10106,7 +10389,7 @@
           <w:noProof/>
         </w:rPr>
       </w:pPr>
-      <w:bookmarkStart w:id="22" w:name="_Toc241773874"/>
+      <w:bookmarkStart w:id="24" w:name="_Toc241832965"/>
       <w:r>
         <w:rPr>
           <w:noProof/>
@@ -10114,7 +10397,7 @@
         <w:lastRenderedPageBreak/>
         <w:t>InitialiseLayout</w:t>
       </w:r>
-      <w:bookmarkEnd w:id="22"/>
+      <w:bookmarkEnd w:id="24"/>
     </w:p>
     <w:p/>
     <w:p>
@@ -11077,8 +11360,8 @@
           <w:sz w:val="28"/>
         </w:rPr>
       </w:pPr>
-      <w:bookmarkStart w:id="23" w:name="_The_Organic_Pads"/>
-      <w:bookmarkEnd w:id="23"/>
+      <w:bookmarkStart w:id="25" w:name="_The_Organic_Pads"/>
+      <w:bookmarkEnd w:id="25"/>
       <w:r>
         <w:br w:type="page"/>
       </w:r>
@@ -11087,12 +11370,12 @@
       <w:pPr>
         <w:pStyle w:val="Heading3"/>
       </w:pPr>
-      <w:bookmarkStart w:id="24" w:name="_Toc241773875"/>
+      <w:bookmarkStart w:id="26" w:name="_Toc241832966"/>
       <w:r>
         <w:lastRenderedPageBreak/>
         <w:t>The Organic Pads sound bank</w:t>
       </w:r>
-      <w:bookmarkEnd w:id="24"/>
+      <w:bookmarkEnd w:id="26"/>
     </w:p>
     <w:p>
       <w:pPr>
@@ -12101,14 +12384,14 @@
       <w:pPr>
         <w:pStyle w:val="Heading3"/>
       </w:pPr>
-      <w:bookmarkStart w:id="25" w:name="_Toc241773876"/>
+      <w:bookmarkStart w:id="27" w:name="_Toc241832967"/>
       <w:r>
         <w:t>Script s</w:t>
       </w:r>
       <w:r>
         <w:t>etup for Organic Pads</w:t>
       </w:r>
-      <w:bookmarkEnd w:id="25"/>
+      <w:bookmarkEnd w:id="27"/>
     </w:p>
     <w:p/>
     <w:p>
@@ -12251,7 +12534,7 @@
       <w:pPr>
         <w:pStyle w:val="Heading3"/>
       </w:pPr>
-      <w:bookmarkStart w:id="26" w:name="_Toc241773877"/>
+      <w:bookmarkStart w:id="28" w:name="_Toc241832968"/>
       <w:r>
         <w:t xml:space="preserve">More about the </w:t>
       </w:r>
@@ -12270,7 +12553,7 @@
         </w:rPr>
         <w:t xml:space="preserve"> script</w:t>
       </w:r>
-      <w:bookmarkEnd w:id="26"/>
+      <w:bookmarkEnd w:id="28"/>
     </w:p>
     <w:p/>
     <w:p>
@@ -12500,7 +12783,7 @@
           <w:noProof/>
         </w:rPr>
       </w:pPr>
-      <w:bookmarkStart w:id="27" w:name="_Toc241773878"/>
+      <w:bookmarkStart w:id="29" w:name="_Toc241832969"/>
       <w:r>
         <w:rPr>
           <w:noProof/>
@@ -12508,7 +12791,7 @@
         <w:lastRenderedPageBreak/>
         <w:t>MoveZeroedMacrosToEnd</w:t>
       </w:r>
-      <w:bookmarkEnd w:id="27"/>
+      <w:bookmarkEnd w:id="29"/>
     </w:p>
     <w:p/>
     <w:p>
@@ -13195,16 +13478,16 @@
           <w:noProof/>
         </w:rPr>
       </w:pPr>
-      <w:bookmarkStart w:id="28" w:name="_PrependPathLineToDescription"/>
-      <w:bookmarkStart w:id="29" w:name="_Toc241773879"/>
-      <w:bookmarkEnd w:id="28"/>
+      <w:bookmarkStart w:id="30" w:name="_PrependPathLineToDescription"/>
+      <w:bookmarkStart w:id="31" w:name="_Toc241832970"/>
+      <w:bookmarkEnd w:id="30"/>
       <w:r>
         <w:rPr>
           <w:noProof/>
         </w:rPr>
         <w:t>PrependPathLineToDescription</w:t>
       </w:r>
-      <w:bookmarkEnd w:id="29"/>
+      <w:bookmarkEnd w:id="31"/>
     </w:p>
     <w:p/>
     <w:p>
@@ -13639,7 +13922,7 @@
           <w:noProof/>
         </w:rPr>
       </w:pPr>
-      <w:bookmarkStart w:id="30" w:name="_Toc241773880"/>
+      <w:bookmarkStart w:id="32" w:name="_Toc241832971"/>
       <w:r>
         <w:rPr>
           <w:noProof/>
@@ -13647,7 +13930,7 @@
         <w:lastRenderedPageBreak/>
         <w:t>RemoveArpeggiatorsAndSequencing</w:t>
       </w:r>
-      <w:bookmarkEnd w:id="30"/>
+      <w:bookmarkEnd w:id="32"/>
     </w:p>
     <w:p/>
     <w:p>
@@ -13746,16 +14029,16 @@
           <w:noProof/>
         </w:rPr>
       </w:pPr>
-      <w:bookmarkStart w:id="31" w:name="_RemoveDelayEffectsAndMacros"/>
-      <w:bookmarkStart w:id="32" w:name="_Toc241773881"/>
-      <w:bookmarkEnd w:id="31"/>
+      <w:bookmarkStart w:id="33" w:name="_RemoveDelayEffectsAndMacros"/>
+      <w:bookmarkStart w:id="34" w:name="_Toc241832972"/>
+      <w:bookmarkEnd w:id="33"/>
       <w:r>
         <w:rPr>
           <w:noProof/>
         </w:rPr>
         <w:t>RemoveDelayEffectsAndMacros</w:t>
       </w:r>
-      <w:bookmarkEnd w:id="32"/>
+      <w:bookmarkEnd w:id="34"/>
     </w:p>
     <w:p/>
     <w:p>
@@ -14073,9 +14356,9 @@
           <w:noProof/>
         </w:rPr>
       </w:pPr>
-      <w:bookmarkStart w:id="33" w:name="_ReplaceModWheelWithMacro"/>
-      <w:bookmarkStart w:id="34" w:name="_Toc241773882"/>
-      <w:bookmarkEnd w:id="33"/>
+      <w:bookmarkStart w:id="35" w:name="_ReplaceModWheelWithMacro"/>
+      <w:bookmarkStart w:id="36" w:name="_Toc241832973"/>
+      <w:bookmarkEnd w:id="35"/>
       <w:r>
         <w:rPr>
           <w:noProof/>
@@ -14083,7 +14366,7 @@
         <w:lastRenderedPageBreak/>
         <w:t>ReplaceModWheelWithMacro</w:t>
       </w:r>
-      <w:bookmarkEnd w:id="34"/>
+      <w:bookmarkEnd w:id="36"/>
     </w:p>
     <w:p/>
     <w:p>
@@ -14674,16 +14957,16 @@
           <w:noProof/>
         </w:rPr>
       </w:pPr>
-      <w:bookmarkStart w:id="35" w:name="_RestoreOriginal"/>
-      <w:bookmarkStart w:id="36" w:name="_Toc241773883"/>
-      <w:bookmarkEnd w:id="35"/>
+      <w:bookmarkStart w:id="37" w:name="_RestoreOriginal"/>
+      <w:bookmarkStart w:id="38" w:name="_Toc241832974"/>
+      <w:bookmarkEnd w:id="37"/>
       <w:r>
         <w:rPr>
           <w:noProof/>
         </w:rPr>
         <w:t>RestoreOriginal</w:t>
       </w:r>
-      <w:bookmarkEnd w:id="36"/>
+      <w:bookmarkEnd w:id="38"/>
     </w:p>
     <w:p/>
     <w:p>
@@ -14866,9 +15149,9 @@
           <w:noProof/>
         </w:rPr>
       </w:pPr>
-      <w:bookmarkStart w:id="37" w:name="_ReuseCc1"/>
-      <w:bookmarkStart w:id="38" w:name="_Toc241773884"/>
-      <w:bookmarkEnd w:id="37"/>
+      <w:bookmarkStart w:id="39" w:name="_ReuseCc1"/>
+      <w:bookmarkStart w:id="40" w:name="_Toc241832975"/>
+      <w:bookmarkEnd w:id="39"/>
       <w:r>
         <w:rPr>
           <w:noProof/>
@@ -14876,7 +15159,7 @@
         <w:lastRenderedPageBreak/>
         <w:t>ReuseCc1</w:t>
       </w:r>
-      <w:bookmarkEnd w:id="38"/>
+      <w:bookmarkEnd w:id="40"/>
     </w:p>
     <w:p/>
     <w:p>
@@ -16868,7 +17151,7 @@
           <w:noProof/>
         </w:rPr>
       </w:pPr>
-      <w:bookmarkStart w:id="39" w:name="_Toc241773885"/>
+      <w:bookmarkStart w:id="41" w:name="_Toc241832976"/>
       <w:r>
         <w:rPr>
           <w:noProof/>
@@ -16876,7 +17159,7 @@
         <w:lastRenderedPageBreak/>
         <w:t>ZeroReleaseMacro</w:t>
       </w:r>
-      <w:bookmarkEnd w:id="39"/>
+      <w:bookmarkEnd w:id="41"/>
     </w:p>
     <w:p/>
     <w:p>
@@ -17077,14 +17360,14 @@
           <w:noProof/>
         </w:rPr>
       </w:pPr>
-      <w:bookmarkStart w:id="40" w:name="_Toc241773886"/>
+      <w:bookmarkStart w:id="42" w:name="_Toc241832977"/>
       <w:r>
         <w:rPr>
           <w:noProof/>
         </w:rPr>
         <w:t>ZeroReverbMacros</w:t>
       </w:r>
-      <w:bookmarkEnd w:id="40"/>
+      <w:bookmarkEnd w:id="42"/>
     </w:p>
     <w:p/>
     <w:p>
@@ -17664,6 +17947,92 @@
     </w:lvl>
   </w:abstractNum>
   <w:abstractNum w:abstractNumId="2" w15:restartNumberingAfterBreak="0">
+    <w:nsid w:val="0ADB229C"/>
+    <w:multiLevelType w:val="hybridMultilevel"/>
+    <w:tmpl w:val="F4200FBC"/>
+    <w:lvl w:ilvl="0" w:tplc="1409000F">
+      <w:start w:val="1"/>
+      <w:numFmt w:val="decimal"/>
+      <w:lvlText w:val="%1."/>
+      <w:lvlJc w:val="left"/>
+      <w:pPr>
+        <w:ind w:left="720" w:hanging="360"/>
+      </w:pPr>
+    </w:lvl>
+    <w:lvl w:ilvl="1" w:tplc="14090019" w:tentative="1">
+      <w:start w:val="1"/>
+      <w:numFmt w:val="lowerLetter"/>
+      <w:lvlText w:val="%2."/>
+      <w:lvlJc w:val="left"/>
+      <w:pPr>
+        <w:ind w:left="1440" w:hanging="360"/>
+      </w:pPr>
+    </w:lvl>
+    <w:lvl w:ilvl="2" w:tplc="1409001B" w:tentative="1">
+      <w:start w:val="1"/>
+      <w:numFmt w:val="lowerRoman"/>
+      <w:lvlText w:val="%3."/>
+      <w:lvlJc w:val="right"/>
+      <w:pPr>
+        <w:ind w:left="2160" w:hanging="180"/>
+      </w:pPr>
+    </w:lvl>
+    <w:lvl w:ilvl="3" w:tplc="1409000F" w:tentative="1">
+      <w:start w:val="1"/>
+      <w:numFmt w:val="decimal"/>
+      <w:lvlText w:val="%4."/>
+      <w:lvlJc w:val="left"/>
+      <w:pPr>
+        <w:ind w:left="2880" w:hanging="360"/>
+      </w:pPr>
+    </w:lvl>
+    <w:lvl w:ilvl="4" w:tplc="14090019" w:tentative="1">
+      <w:start w:val="1"/>
+      <w:numFmt w:val="lowerLetter"/>
+      <w:lvlText w:val="%5."/>
+      <w:lvlJc w:val="left"/>
+      <w:pPr>
+        <w:ind w:left="3600" w:hanging="360"/>
+      </w:pPr>
+    </w:lvl>
+    <w:lvl w:ilvl="5" w:tplc="1409001B" w:tentative="1">
+      <w:start w:val="1"/>
+      <w:numFmt w:val="lowerRoman"/>
+      <w:lvlText w:val="%6."/>
+      <w:lvlJc w:val="right"/>
+      <w:pPr>
+        <w:ind w:left="4320" w:hanging="180"/>
+      </w:pPr>
+    </w:lvl>
+    <w:lvl w:ilvl="6" w:tplc="1409000F" w:tentative="1">
+      <w:start w:val="1"/>
+      <w:numFmt w:val="decimal"/>
+      <w:lvlText w:val="%7."/>
+      <w:lvlJc w:val="left"/>
+      <w:pPr>
+        <w:ind w:left="5040" w:hanging="360"/>
+      </w:pPr>
+    </w:lvl>
+    <w:lvl w:ilvl="7" w:tplc="14090019" w:tentative="1">
+      <w:start w:val="1"/>
+      <w:numFmt w:val="lowerLetter"/>
+      <w:lvlText w:val="%8."/>
+      <w:lvlJc w:val="left"/>
+      <w:pPr>
+        <w:ind w:left="5760" w:hanging="360"/>
+      </w:pPr>
+    </w:lvl>
+    <w:lvl w:ilvl="8" w:tplc="1409001B" w:tentative="1">
+      <w:start w:val="1"/>
+      <w:numFmt w:val="lowerRoman"/>
+      <w:lvlText w:val="%9."/>
+      <w:lvlJc w:val="right"/>
+      <w:pPr>
+        <w:ind w:left="6480" w:hanging="180"/>
+      </w:pPr>
+    </w:lvl>
+  </w:abstractNum>
+  <w:abstractNum w:abstractNumId="3" w15:restartNumberingAfterBreak="0">
     <w:nsid w:val="1C551637"/>
     <w:multiLevelType w:val="multilevel"/>
     <w:tmpl w:val="D2C8C798"/>
@@ -17806,7 +18175,7 @@
       </w:rPr>
     </w:lvl>
   </w:abstractNum>
-  <w:abstractNum w:abstractNumId="3" w15:restartNumberingAfterBreak="0">
+  <w:abstractNum w:abstractNumId="4" w15:restartNumberingAfterBreak="0">
     <w:nsid w:val="297238C7"/>
     <w:multiLevelType w:val="multilevel"/>
     <w:tmpl w:val="20720E5A"/>
@@ -17928,7 +18297,7 @@
       </w:rPr>
     </w:lvl>
   </w:abstractNum>
-  <w:abstractNum w:abstractNumId="4" w15:restartNumberingAfterBreak="0">
+  <w:abstractNum w:abstractNumId="5" w15:restartNumberingAfterBreak="0">
     <w:nsid w:val="2E9A0602"/>
     <w:multiLevelType w:val="multilevel"/>
     <w:tmpl w:val="20720E5A"/>
@@ -18051,7 +18420,7 @@
       </w:rPr>
     </w:lvl>
   </w:abstractNum>
-  <w:abstractNum w:abstractNumId="5" w15:restartNumberingAfterBreak="0">
+  <w:abstractNum w:abstractNumId="6" w15:restartNumberingAfterBreak="0">
     <w:nsid w:val="668A1C11"/>
     <w:multiLevelType w:val="multilevel"/>
     <w:tmpl w:val="91D04B0A"/>
@@ -18180,7 +18549,7 @@
     </w:lvl>
   </w:abstractNum>
   <w:num w:numId="1" w16cid:durableId="218635295">
-    <w:abstractNumId w:val="5"/>
+    <w:abstractNumId w:val="6"/>
   </w:num>
   <w:num w:numId="2" w16cid:durableId="927033806">
     <w:abstractNumId w:val="1"/>
@@ -18189,31 +18558,31 @@
     <w:abstractNumId w:val="0"/>
   </w:num>
   <w:num w:numId="4" w16cid:durableId="247812926">
+    <w:abstractNumId w:val="4"/>
+  </w:num>
+  <w:num w:numId="5" w16cid:durableId="1069694443">
     <w:abstractNumId w:val="3"/>
   </w:num>
-  <w:num w:numId="5" w16cid:durableId="1069694443">
-    <w:abstractNumId w:val="2"/>
-  </w:num>
   <w:num w:numId="6" w16cid:durableId="2129162174">
-    <w:abstractNumId w:val="3"/>
+    <w:abstractNumId w:val="4"/>
   </w:num>
   <w:num w:numId="7" w16cid:durableId="161169452">
-    <w:abstractNumId w:val="5"/>
+    <w:abstractNumId w:val="6"/>
   </w:num>
   <w:num w:numId="8" w16cid:durableId="622929291">
-    <w:abstractNumId w:val="5"/>
+    <w:abstractNumId w:val="6"/>
   </w:num>
   <w:num w:numId="9" w16cid:durableId="1634559689">
-    <w:abstractNumId w:val="5"/>
+    <w:abstractNumId w:val="6"/>
   </w:num>
   <w:num w:numId="10" w16cid:durableId="927427189">
-    <w:abstractNumId w:val="5"/>
+    <w:abstractNumId w:val="6"/>
   </w:num>
   <w:num w:numId="11" w16cid:durableId="1665741472">
-    <w:abstractNumId w:val="5"/>
+    <w:abstractNumId w:val="6"/>
   </w:num>
   <w:num w:numId="12" w16cid:durableId="818155233">
-    <w:abstractNumId w:val="5"/>
+    <w:abstractNumId w:val="6"/>
   </w:num>
   <w:num w:numId="13" w16cid:durableId="606158387">
     <w:abstractNumId w:val="1"/>
@@ -18222,13 +18591,16 @@
     <w:abstractNumId w:val="0"/>
   </w:num>
   <w:num w:numId="15" w16cid:durableId="375085238">
+    <w:abstractNumId w:val="4"/>
+  </w:num>
+  <w:num w:numId="16" w16cid:durableId="1120491005">
     <w:abstractNumId w:val="3"/>
   </w:num>
-  <w:num w:numId="16" w16cid:durableId="1120491005">
+  <w:num w:numId="17" w16cid:durableId="1031105500">
+    <w:abstractNumId w:val="5"/>
+  </w:num>
+  <w:num w:numId="18" w16cid:durableId="337081965">
     <w:abstractNumId w:val="2"/>
-  </w:num>
-  <w:num w:numId="17" w16cid:durableId="1031105500">
-    <w:abstractNumId w:val="4"/>
   </w:num>
   <w:numIdMacAtCleanup w:val="5"/>
 </w:numbering>

</xml_diff>

<commit_message>
macOS Changed hotkey modifier to Cmd: manual updated.
</commit_message>
<xml_diff>
--- a/Documentation/Falcon Programmer Manual.docx
+++ b/Documentation/Falcon Programmer Manual.docx
@@ -195,7 +195,7 @@
           <w:sz w:val="48"/>
           <w:szCs w:val="48"/>
         </w:rPr>
-        <w:t>2</w:t>
+        <w:t>3</w:t>
       </w:r>
       <w:r>
         <w:rPr>
@@ -203,7 +203,7 @@
           <w:szCs w:val="48"/>
           <w:vertAlign w:val="superscript"/>
         </w:rPr>
-        <w:t>nd</w:t>
+        <w:t>rd</w:t>
       </w:r>
       <w:r>
         <w:rPr>
@@ -698,7 +698,21 @@
                 <w:rStyle w:val="Hyperlink"/>
                 <w:noProof/>
               </w:rPr>
-              <w:t>Hotkeys</w:t>
+              <w:t>Hotk</w:t>
+            </w:r>
+            <w:r>
+              <w:rPr>
+                <w:rStyle w:val="Hyperlink"/>
+                <w:noProof/>
+              </w:rPr>
+              <w:t>e</w:t>
+            </w:r>
+            <w:r>
+              <w:rPr>
+                <w:rStyle w:val="Hyperlink"/>
+                <w:noProof/>
+              </w:rPr>
+              <w:t>ys</w:t>
             </w:r>
             <w:r>
               <w:rPr>
@@ -5047,7 +5061,16 @@
         <w:t xml:space="preserve">, when pressed with the </w:t>
       </w:r>
       <w:r>
-        <w:t>Alt (Windows) / Option (macOS)</w:t>
+        <w:t xml:space="preserve">Alt (Windows) / </w:t>
+      </w:r>
+      <w:r>
+        <w:rPr>
+          <w:noProof/>
+        </w:rPr>
+        <w:t>Cmd</w:t>
+      </w:r>
+      <w:r>
+        <w:t xml:space="preserve"> (macOS)</w:t>
       </w:r>
       <w:r>
         <w:t xml:space="preserve"> key down,</w:t>
@@ -5064,8 +5087,11 @@
       <w:r>
         <w:t>.</w:t>
       </w:r>
-      <w:r>
-        <w:t xml:space="preserve"> The underlined hotkey letter in the caption of any other control, such as the </w:t>
+    </w:p>
+    <w:p/>
+    <w:p>
+      <w:r>
+        <w:t xml:space="preserve">The underlined hotkey letter in the caption of any other control, such as the </w:t>
       </w:r>
       <w:r>
         <w:rPr>
@@ -5096,13 +5122,40 @@
         <w:t xml:space="preserve"> page, when pressed with the </w:t>
       </w:r>
       <w:r>
-        <w:t>Alt (Windows) / Option (macOS)</w:t>
+        <w:t xml:space="preserve">Alt (Windows) / </w:t>
+      </w:r>
+      <w:r>
+        <w:rPr>
+          <w:noProof/>
+        </w:rPr>
+        <w:t>Cmd</w:t>
+      </w:r>
+      <w:r>
+        <w:t xml:space="preserve"> (macOS)</w:t>
       </w:r>
       <w:r>
         <w:t xml:space="preserve"> key down, activates the required control without focusing it.</w:t>
       </w:r>
-      <w:r>
-        <w:t xml:space="preserve">  To select a menu item, the Alt/Option key is optional.</w:t>
+    </w:p>
+    <w:p/>
+    <w:p>
+      <w:r>
+        <w:t xml:space="preserve">To select a menu item, the </w:t>
+      </w:r>
+      <w:r>
+        <w:rPr>
+          <w:noProof/>
+        </w:rPr>
+        <w:t>Alt/</w:t>
+      </w:r>
+      <w:r>
+        <w:rPr>
+          <w:noProof/>
+        </w:rPr>
+        <w:t>Cmd</w:t>
+      </w:r>
+      <w:r>
+        <w:t xml:space="preserve"> key is optional.</w:t>
       </w:r>
     </w:p>
     <w:p/>
@@ -5136,7 +5189,20 @@
         <w:rPr>
           <w:rFonts w:ascii="Georgia" w:hAnsi="Georgia"/>
         </w:rPr>
-        <w:t xml:space="preserve"> (Windows) / Option (macOS)</w:t>
+        <w:t xml:space="preserve"> (Windows) / </w:t>
+      </w:r>
+      <w:r>
+        <w:rPr>
+          <w:rFonts w:ascii="Georgia" w:hAnsi="Georgia"/>
+          <w:noProof/>
+        </w:rPr>
+        <w:t>Cmd</w:t>
+      </w:r>
+      <w:r>
+        <w:rPr>
+          <w:rFonts w:ascii="Georgia" w:hAnsi="Georgia"/>
+        </w:rPr>
+        <w:t xml:space="preserve"> (macOS)</w:t>
       </w:r>
       <w:r>
         <w:rPr>

</xml_diff>

<commit_message>
Manual update, copied to application, updated Windows installer.
</commit_message>
<xml_diff>
--- a/Documentation/Falcon Programmer Manual.docx
+++ b/Documentation/Falcon Programmer Manual.docx
@@ -2399,12 +2399,6 @@
       </w:r>
       <w:r>
         <w:t>or application software updates.</w:t>
-      </w:r>
-    </w:p>
-    <w:p/>
-    <w:p>
-      <w:r>
-        <w:t>Much smaller Windows installer and application.</w:t>
       </w:r>
     </w:p>
     <w:p/>

</xml_diff>